<commit_message>
feat: los tres inventarios de ALM-PNO-002 (MP, MEP y PT) en un solo sistema
- app/inventarios.py: registro de tipos con archivo, unidad, zonas y frecuencia de reporte
  (mensual MP/MEP §V.2.1.8, semanal PT §V.2.3.8).
- Inventario acepta tipo, detecta encabezados por nombre (Descripción/Producto/Material,
  Cantidad/Conteo/Stock, UM) y normaliza unidades (pz->pza).
- bitacora: columna inventario + índice despues del ALTER (migracion de bases viejas),
  consultas y deshacer filtrados por tipo.
- F01 consolidado: Portada con totales (una pagina) + una hoja por inventario.
- API: ?tipo= en todas las rutas, /api/inventarios, descargas por tipo.
- UI: selector MP/MEP/PT, tablero de los tres, estado 'vacio' cuando falta cargar.
- scripts: plantilla_inventario.py (--vacia), preparar_inventario --tipo, sembrar_demo_mep_pt.py.
- docs: LEEME, README, guia operativa y guia de comandos actualizadas; demo_F01 consolidado.
- Tests: 63 OK (16 multitipo + 6 API multi).
</commit_message>
<xml_diff>
--- a/docs/Guia_instalacion_comandos.docx
+++ b/docs/Guia_instalacion_comandos.docx
@@ -1120,7 +1120,31 @@
         <w:rPr>
           <w:sz w:val="19"/>
         </w:rPr>
-        <w:t>Si el Excel del área está en el escritorio:</w:t>
+        <w:t>El sistema maneja tres inventarios (ALM-PNO-002): materias primas, material de empaque y producto</w:t>
+      </w:r>
+    </w:p>
+    <w:p>
+      <w:pPr>
+        <w:spacing w:after="80"/>
+      </w:pPr>
+      <w:r>
+        <w:rPr>
+          <w:sz w:val="19"/>
+        </w:rPr>
+        <w:t xml:space="preserve">terminado. Cada uno es un archivo en </w:t>
+      </w:r>
+      <w:r>
+        <w:rPr>
+          <w:rFonts w:ascii="Consolas" w:hAnsi="Consolas" w:eastAsia="Consolas"/>
+          <w:sz w:val="18"/>
+        </w:rPr>
+        <w:t>data\</w:t>
+      </w:r>
+      <w:r>
+        <w:rPr>
+          <w:sz w:val="19"/>
+        </w:rPr>
+        <w:t xml:space="preserve"> y se prepara igual:</w:t>
       </w:r>
     </w:p>
     <w:p>
@@ -1135,36 +1159,7 @@
           <w:color w:val="111827"/>
           <w:sz w:val="17"/>
         </w:rPr>
-        <w:t>python scripts\preparar_inventario.py --origen "%USERPROFILE%\Desktop\INVENTARIO MP.xlsx"</w:t>
-      </w:r>
-    </w:p>
-    <w:p>
-      <w:pPr>
-        <w:spacing w:after="40"/>
-      </w:pPr>
-    </w:p>
-    <w:p>
-      <w:pPr>
-        <w:spacing w:after="80"/>
-      </w:pPr>
-      <w:r>
-        <w:rPr>
-          <w:sz w:val="19"/>
-        </w:rPr>
-        <w:t xml:space="preserve">Si ya lo copiaste a </w:t>
-      </w:r>
-      <w:r>
-        <w:rPr>
-          <w:rFonts w:ascii="Consolas" w:hAnsi="Consolas" w:eastAsia="Consolas"/>
-          <w:sz w:val="18"/>
-        </w:rPr>
-        <w:t>datos_iniciales\Inventario_MP.xlsx</w:t>
-      </w:r>
-      <w:r>
-        <w:rPr>
-          <w:sz w:val="19"/>
-        </w:rPr>
-        <w:t>:</w:t>
+        <w:t>python scripts\preparar_inventario.py --tipo mp  --origen "%USERPROFILE%\Desktop\INVENTARIO MP.xlsx"</w:t>
       </w:r>
     </w:p>
     <w:p>
@@ -1179,7 +1174,114 @@
           <w:color w:val="111827"/>
           <w:sz w:val="17"/>
         </w:rPr>
-        <w:t>python scripts\preparar_inventario.py --origen datos_iniciales\Inventario_MP.xlsx</w:t>
+        <w:t>python scripts\preparar_inventario.py --tipo mep --origen "D:\inventarios\INVENTARIO MEP.xlsx"</w:t>
+      </w:r>
+    </w:p>
+    <w:p>
+      <w:pPr>
+        <w:spacing w:before="0" w:after="0" w:line="240" w:lineRule="auto"/>
+        <w:ind w:left="170"/>
+        <w:shd w:val="clear" w:color="auto" w:fill="F2F4F7"/>
+      </w:pPr>
+      <w:r>
+        <w:rPr>
+          <w:rFonts w:ascii="Consolas" w:hAnsi="Consolas" w:eastAsia="Consolas"/>
+          <w:color w:val="111827"/>
+          <w:sz w:val="17"/>
+        </w:rPr>
+        <w:t>python scripts\preparar_inventario.py --tipo pt  --origen "D:\inventarios\INVENTARIO PT.xlsx"</w:t>
+      </w:r>
+    </w:p>
+    <w:p>
+      <w:pPr>
+        <w:spacing w:after="40"/>
+      </w:pPr>
+    </w:p>
+    <w:p>
+      <w:pPr>
+        <w:spacing w:after="80"/>
+      </w:pPr>
+      <w:r>
+        <w:rPr>
+          <w:sz w:val="19"/>
+        </w:rPr>
+        <w:t>Si todavía no hay archivo de empaque o de producto terminado, se crea la plantilla vacía:</w:t>
+      </w:r>
+    </w:p>
+    <w:p>
+      <w:pPr>
+        <w:spacing w:before="0" w:after="0" w:line="240" w:lineRule="auto"/>
+        <w:ind w:left="170"/>
+        <w:shd w:val="clear" w:color="auto" w:fill="F2F4F7"/>
+      </w:pPr>
+      <w:r>
+        <w:rPr>
+          <w:rFonts w:ascii="Consolas" w:hAnsi="Consolas" w:eastAsia="Consolas"/>
+          <w:color w:val="111827"/>
+          <w:sz w:val="17"/>
+        </w:rPr>
+        <w:t>python scripts\plantilla_inventario.py --tipo mep --vacia</w:t>
+      </w:r>
+    </w:p>
+    <w:p>
+      <w:pPr>
+        <w:spacing w:before="0" w:after="0" w:line="240" w:lineRule="auto"/>
+        <w:ind w:left="170"/>
+        <w:shd w:val="clear" w:color="auto" w:fill="F2F4F7"/>
+      </w:pPr>
+      <w:r>
+        <w:rPr>
+          <w:rFonts w:ascii="Consolas" w:hAnsi="Consolas" w:eastAsia="Consolas"/>
+          <w:color w:val="111827"/>
+          <w:sz w:val="17"/>
+        </w:rPr>
+        <w:t>python scripts\plantilla_inventario.py --tipo pt --vacia</w:t>
+      </w:r>
+    </w:p>
+    <w:p>
+      <w:pPr>
+        <w:spacing w:after="40"/>
+      </w:pPr>
+    </w:p>
+    <w:p>
+      <w:pPr>
+        <w:spacing w:after="80"/>
+      </w:pPr>
+      <w:r>
+        <w:rPr>
+          <w:sz w:val="19"/>
+        </w:rPr>
+        <w:t>PowerShell es idéntico (solo cambian las comillas si la ruta tiene espacios):</w:t>
+      </w:r>
+    </w:p>
+    <w:p>
+      <w:pPr>
+        <w:spacing w:before="0" w:after="0" w:line="240" w:lineRule="auto"/>
+        <w:ind w:left="170"/>
+        <w:shd w:val="clear" w:color="auto" w:fill="F2F4F7"/>
+      </w:pPr>
+      <w:r>
+        <w:rPr>
+          <w:rFonts w:ascii="Consolas" w:hAnsi="Consolas" w:eastAsia="Consolas"/>
+          <w:color w:val="111827"/>
+          <w:sz w:val="17"/>
+        </w:rPr>
+        <w:t>python scripts\preparar_inventario.py --tipo mep --origen "D:\inventarios\INVENTARIO MEP.xlsx"</w:t>
+      </w:r>
+    </w:p>
+    <w:p>
+      <w:pPr>
+        <w:spacing w:before="0" w:after="0" w:line="240" w:lineRule="auto"/>
+        <w:ind w:left="170"/>
+        <w:shd w:val="clear" w:color="auto" w:fill="F2F4F7"/>
+      </w:pPr>
+      <w:r>
+        <w:rPr>
+          <w:rFonts w:ascii="Consolas" w:hAnsi="Consolas" w:eastAsia="Consolas"/>
+          <w:color w:val="111827"/>
+          <w:sz w:val="17"/>
+        </w:rPr>
+        <w:t>python scripts\plantilla_inventario.py --tipo pt --vacia</w:t>
       </w:r>
     </w:p>
     <w:p>
@@ -1210,6 +1312,369 @@
         </w:rPr>
         <w:t>, no toca las demás columnas y reporta cuántos lotes quedaron.</w:t>
       </w:r>
+    </w:p>
+    <w:p>
+      <w:pPr>
+        <w:spacing w:after="80"/>
+      </w:pPr>
+      <w:r>
+        <w:rPr>
+          <w:sz w:val="19"/>
+        </w:rPr>
+        <w:t>Reconoce los encabezados por nombre (</w:t>
+      </w:r>
+      <w:r>
+        <w:rPr>
+          <w:rFonts w:ascii="Consolas" w:hAnsi="Consolas" w:eastAsia="Consolas"/>
+          <w:sz w:val="18"/>
+        </w:rPr>
+        <w:t>Descripción</w:t>
+      </w:r>
+      <w:r>
+        <w:rPr>
+          <w:sz w:val="19"/>
+        </w:rPr>
+        <w:t>/</w:t>
+      </w:r>
+      <w:r>
+        <w:rPr>
+          <w:rFonts w:ascii="Consolas" w:hAnsi="Consolas" w:eastAsia="Consolas"/>
+          <w:sz w:val="18"/>
+        </w:rPr>
+        <w:t>Producto</w:t>
+      </w:r>
+      <w:r>
+        <w:rPr>
+          <w:sz w:val="19"/>
+        </w:rPr>
+        <w:t>/</w:t>
+      </w:r>
+      <w:r>
+        <w:rPr>
+          <w:rFonts w:ascii="Consolas" w:hAnsi="Consolas" w:eastAsia="Consolas"/>
+          <w:sz w:val="18"/>
+        </w:rPr>
+        <w:t>Material</w:t>
+      </w:r>
+      <w:r>
+        <w:rPr>
+          <w:sz w:val="19"/>
+        </w:rPr>
+        <w:t xml:space="preserve">, </w:t>
+      </w:r>
+      <w:r>
+        <w:rPr>
+          <w:rFonts w:ascii="Consolas" w:hAnsi="Consolas" w:eastAsia="Consolas"/>
+          <w:sz w:val="18"/>
+        </w:rPr>
+        <w:t>Cantidad</w:t>
+      </w:r>
+      <w:r>
+        <w:rPr>
+          <w:sz w:val="19"/>
+        </w:rPr>
+        <w:t>/</w:t>
+      </w:r>
+      <w:r>
+        <w:rPr>
+          <w:rFonts w:ascii="Consolas" w:hAnsi="Consolas" w:eastAsia="Consolas"/>
+          <w:sz w:val="18"/>
+        </w:rPr>
+        <w:t>Conteo</w:t>
+      </w:r>
+      <w:r>
+        <w:rPr>
+          <w:sz w:val="19"/>
+        </w:rPr>
+        <w:t>/</w:t>
+      </w:r>
+      <w:r>
+        <w:rPr>
+          <w:rFonts w:ascii="Consolas" w:hAnsi="Consolas" w:eastAsia="Consolas"/>
+          <w:sz w:val="18"/>
+        </w:rPr>
+        <w:t>Stock</w:t>
+      </w:r>
+      <w:r>
+        <w:rPr>
+          <w:sz w:val="19"/>
+        </w:rPr>
+        <w:t>,</w:t>
+      </w:r>
+    </w:p>
+    <w:p>
+      <w:pPr>
+        <w:spacing w:after="80"/>
+      </w:pPr>
+      <w:r>
+        <w:rPr>
+          <w:rFonts w:ascii="Consolas" w:hAnsi="Consolas" w:eastAsia="Consolas"/>
+          <w:sz w:val="18"/>
+        </w:rPr>
+        <w:t>Lote</w:t>
+      </w:r>
+      <w:r>
+        <w:rPr>
+          <w:sz w:val="19"/>
+        </w:rPr>
+        <w:t xml:space="preserve">, </w:t>
+      </w:r>
+      <w:r>
+        <w:rPr>
+          <w:rFonts w:ascii="Consolas" w:hAnsi="Consolas" w:eastAsia="Consolas"/>
+          <w:sz w:val="18"/>
+        </w:rPr>
+        <w:t>Caducidad</w:t>
+      </w:r>
+      <w:r>
+        <w:rPr>
+          <w:sz w:val="19"/>
+        </w:rPr>
+        <w:t xml:space="preserve">, </w:t>
+      </w:r>
+      <w:r>
+        <w:rPr>
+          <w:rFonts w:ascii="Consolas" w:hAnsi="Consolas" w:eastAsia="Consolas"/>
+          <w:sz w:val="18"/>
+        </w:rPr>
+        <w:t>Unidad</w:t>
+      </w:r>
+      <w:r>
+        <w:rPr>
+          <w:sz w:val="19"/>
+        </w:rPr>
+        <w:t>/</w:t>
+      </w:r>
+      <w:r>
+        <w:rPr>
+          <w:rFonts w:ascii="Consolas" w:hAnsi="Consolas" w:eastAsia="Consolas"/>
+          <w:sz w:val="18"/>
+        </w:rPr>
+        <w:t>UM</w:t>
+      </w:r>
+      <w:r>
+        <w:rPr>
+          <w:sz w:val="19"/>
+        </w:rPr>
+        <w:t>), así que una tabla del área entra sin reformatear. Con</w:t>
+      </w:r>
+    </w:p>
+    <w:p>
+      <w:pPr>
+        <w:spacing w:after="80"/>
+      </w:pPr>
+      <w:r>
+        <w:rPr>
+          <w:rFonts w:ascii="Consolas" w:hAnsi="Consolas" w:eastAsia="Consolas"/>
+          <w:sz w:val="18"/>
+        </w:rPr>
+        <w:t>--reimportar</w:t>
+      </w:r>
+      <w:r>
+        <w:rPr>
+          <w:sz w:val="19"/>
+        </w:rPr>
+        <w:t xml:space="preserve"> toma el archivo nuevo y conserva las ubicaciones ya capturadas.</w:t>
+      </w:r>
+    </w:p>
+    <w:tbl>
+      <w:tblPr>
+        <w:tblStyle w:val="TableGrid"/>
+        <w:tblW w:type="auto" w:w="0"/>
+        <w:tblLook w:firstColumn="1" w:firstRow="1" w:lastColumn="0" w:lastRow="0" w:noHBand="0" w:noVBand="1" w:val="04A0"/>
+      </w:tblPr>
+      <w:tblGrid>
+        <w:gridCol w:w="3437"/>
+        <w:gridCol w:w="3437"/>
+        <w:gridCol w:w="3437"/>
+      </w:tblGrid>
+      <w:tr>
+        <w:tc>
+          <w:tcPr>
+            <w:tcW w:type="dxa" w:w="3437"/>
+          </w:tcPr>
+          <w:p>
+            <w:r/>
+            <w:r>
+              <w:rPr>
+                <w:b/>
+                <w:color w:val="1F3B73"/>
+                <w:sz w:val="16"/>
+              </w:rPr>
+              <w:t>Inventario</w:t>
+            </w:r>
+          </w:p>
+        </w:tc>
+        <w:tc>
+          <w:tcPr>
+            <w:tcW w:type="dxa" w:w="3437"/>
+          </w:tcPr>
+          <w:p>
+            <w:r/>
+            <w:r>
+              <w:rPr>
+                <w:b/>
+                <w:color w:val="1F3B73"/>
+                <w:sz w:val="16"/>
+              </w:rPr>
+              <w:t>Archivo</w:t>
+            </w:r>
+          </w:p>
+        </w:tc>
+        <w:tc>
+          <w:tcPr>
+            <w:tcW w:type="dxa" w:w="3437"/>
+          </w:tcPr>
+          <w:p>
+            <w:r/>
+            <w:r>
+              <w:rPr>
+                <w:b/>
+                <w:color w:val="1F3B73"/>
+                <w:sz w:val="16"/>
+              </w:rPr>
+              <w:t>Reporte que exige el procedimiento</w:t>
+            </w:r>
+          </w:p>
+        </w:tc>
+      </w:tr>
+      <w:tr>
+        <w:tc>
+          <w:tcPr>
+            <w:tcW w:type="dxa" w:w="3437"/>
+          </w:tcPr>
+          <w:p>
+            <w:r/>
+            <w:r>
+              <w:rPr>
+                <w:sz w:val="16"/>
+              </w:rPr>
+              <w:t>MP — materias primas</w:t>
+            </w:r>
+          </w:p>
+        </w:tc>
+        <w:tc>
+          <w:tcPr>
+            <w:tcW w:type="dxa" w:w="3437"/>
+          </w:tcPr>
+          <w:p>
+            <w:r/>
+            <w:r>
+              <w:rPr>
+                <w:sz w:val="16"/>
+              </w:rPr>
+              <w:t>data\Inventario_MP.xlsx</w:t>
+            </w:r>
+          </w:p>
+        </w:tc>
+        <w:tc>
+          <w:tcPr>
+            <w:tcW w:type="dxa" w:w="3437"/>
+          </w:tcPr>
+          <w:p>
+            <w:r/>
+            <w:r>
+              <w:rPr>
+                <w:sz w:val="16"/>
+              </w:rPr>
+              <w:t>mensual (§V.2.1.8)</w:t>
+            </w:r>
+          </w:p>
+        </w:tc>
+      </w:tr>
+      <w:tr>
+        <w:tc>
+          <w:tcPr>
+            <w:tcW w:type="dxa" w:w="3437"/>
+          </w:tcPr>
+          <w:p>
+            <w:r/>
+            <w:r>
+              <w:rPr>
+                <w:sz w:val="16"/>
+              </w:rPr>
+              <w:t>MEP — material de empaque</w:t>
+            </w:r>
+          </w:p>
+        </w:tc>
+        <w:tc>
+          <w:tcPr>
+            <w:tcW w:type="dxa" w:w="3437"/>
+          </w:tcPr>
+          <w:p>
+            <w:r/>
+            <w:r>
+              <w:rPr>
+                <w:sz w:val="16"/>
+              </w:rPr>
+              <w:t>data\Inventario_MEP.xlsx</w:t>
+            </w:r>
+          </w:p>
+        </w:tc>
+        <w:tc>
+          <w:tcPr>
+            <w:tcW w:type="dxa" w:w="3437"/>
+          </w:tcPr>
+          <w:p>
+            <w:r/>
+            <w:r>
+              <w:rPr>
+                <w:sz w:val="16"/>
+              </w:rPr>
+              <w:t>mensual (§V.2.1.8)</w:t>
+            </w:r>
+          </w:p>
+        </w:tc>
+      </w:tr>
+      <w:tr>
+        <w:tc>
+          <w:tcPr>
+            <w:tcW w:type="dxa" w:w="3437"/>
+          </w:tcPr>
+          <w:p>
+            <w:r/>
+            <w:r>
+              <w:rPr>
+                <w:sz w:val="16"/>
+              </w:rPr>
+              <w:t>PT — producto terminado</w:t>
+            </w:r>
+          </w:p>
+        </w:tc>
+        <w:tc>
+          <w:tcPr>
+            <w:tcW w:type="dxa" w:w="3437"/>
+          </w:tcPr>
+          <w:p>
+            <w:r/>
+            <w:r>
+              <w:rPr>
+                <w:sz w:val="16"/>
+              </w:rPr>
+              <w:t>data\Inventario_PT.xlsx</w:t>
+            </w:r>
+          </w:p>
+        </w:tc>
+        <w:tc>
+          <w:tcPr>
+            <w:tcW w:type="dxa" w:w="3437"/>
+          </w:tcPr>
+          <w:p>
+            <w:r/>
+            <w:r>
+              <w:rPr>
+                <w:sz w:val="16"/>
+              </w:rPr>
+              <w:t>semanal (§V.2.3.8)</w:t>
+            </w:r>
+          </w:p>
+        </w:tc>
+      </w:tr>
+    </w:tbl>
+    <w:p>
+      <w:pPr>
+        <w:spacing w:after="40"/>
+      </w:pPr>
     </w:p>
     <w:p>
       <w:pPr>

</xml_diff>